<commit_message>
feat: enhance SPK and BAST handling in SurveyActivityService and related components
</commit_message>
<xml_diff>
--- a/servers/apps/surveyact/templates/bast-spk/template-spk.docx
+++ b/servers/apps/surveyact/templates/bast-spk/template-spk.docx
@@ -916,70 +916,7 @@
         <w:jc w:val="both"/>
       </w:pPr>
       <w:r>
-        <w:t xml:space="preserve">Jangka Waktu Perjanjian terhitung </w:t>
-      </w:r>
-      <w:r>
-        <w:t>tanggal</w:t>
-      </w:r>
-      <w:r>
-        <w:t xml:space="preserve"> </w:t>
-      </w:r>
-      <w:r>
-        <w:t>{tanggal</w:t>
-      </w:r>
-      <w:r>
-        <w:t>Mulai</w:t>
-      </w:r>
-      <w:r>
-        <w:t>}</w:t>
-      </w:r>
-      <w:r>
-        <w:t xml:space="preserve"> </w:t>
-      </w:r>
-      <w:r>
-        <w:t>{bula</w:t>
-      </w:r>
-      <w:r>
-        <w:t>n</w:t>
-      </w:r>
-      <w:r>
-        <w:t>}</w:t>
-      </w:r>
-      <w:r>
-        <w:t xml:space="preserve"> </w:t>
-      </w:r>
-      <w:r>
-        <w:t>sampai dengan tanggal</w:t>
-      </w:r>
-      <w:r>
-        <w:t xml:space="preserve"> </w:t>
-      </w:r>
-      <w:r>
-        <w:t>{tanggal</w:t>
-      </w:r>
-      <w:r>
-        <w:t>Selesai</w:t>
-      </w:r>
-      <w:r>
-        <w:t>}</w:t>
-      </w:r>
-      <w:r>
-        <w:t xml:space="preserve"> </w:t>
-      </w:r>
-      <w:r>
-        <w:t>{bulan}</w:t>
-      </w:r>
-      <w:r>
-        <w:t xml:space="preserve"> </w:t>
-      </w:r>
-      <w:r>
-        <w:t>202</w:t>
-      </w:r>
-      <w:r>
-        <w:t>6</w:t>
-      </w:r>
-      <w:r>
-        <w:t>.</w:t>
+        <w:t>Jangka Waktu Perjanjian terhitung tanggal {tanggalMulaiPerjanjian} sampai dengan tanggal {tanggalSelesaiPerjanjian}.</w:t>
       </w:r>
     </w:p>
     <w:p>
@@ -2695,7 +2632,7 @@
               <w:jc w:val="center"/>
             </w:pPr>
             <w:r>
-              <w:t>{tanggalMulai} s.d {tanggalSelesai} {bulan} {tahun}</w:t>
+              <w:t>{jangkaWaktu}</w:t>
             </w:r>
           </w:p>
         </w:tc>

</xml_diff>